<commit_message>
li'l day 6 work(this binarization looks messy now)
</commit_message>
<xml_diff>
--- a/week1 recap.docx
+++ b/week1 recap.docx
@@ -1722,25 +1722,11 @@
     </w:p>
     <w:p>
       <w:pPr>
-        <w:rPr>
-          <w:b/>
-          <w:bCs/>
-        </w:rPr>
-      </w:pPr>
-      <w:r>
-        <w:rPr>
-          <w:b/>
-          <w:bCs/>
-        </w:rPr>
-        <w:t>Workflow Summary</w:t>
-      </w:r>
-    </w:p>
-    <w:p>
-      <w:pPr>
         <w:numPr>
           <w:ilvl w:val="0"/>
           <w:numId w:val="1"/>
         </w:numPr>
+        <w:spacing w:after="0"/>
       </w:pPr>
       <w:r>
         <w:rPr>
@@ -1756,6 +1742,7 @@
           <w:ilvl w:val="1"/>
           <w:numId w:val="1"/>
         </w:numPr>
+        <w:spacing w:after="0"/>
       </w:pPr>
       <w:r>
         <w:t>Ran view_samples.py with n=50 and seeds ranging from 100–</w:t>
@@ -1784,6 +1771,7 @@
           <w:ilvl w:val="1"/>
           <w:numId w:val="1"/>
         </w:numPr>
+        <w:spacing w:after="0"/>
       </w:pPr>
       <w:r>
         <w:t>Purpose: explore different random slices of the dataset to capture variety in handwriting and image conditions.</w:t>
@@ -1795,6 +1783,7 @@
           <w:ilvl w:val="1"/>
           <w:numId w:val="1"/>
         </w:numPr>
+        <w:spacing w:after="0"/>
       </w:pPr>
       <w:r>
         <w:t>Insight: stop once new seeds stop revealing new issues (saturation point).</w:t>
@@ -1806,6 +1795,7 @@
           <w:ilvl w:val="0"/>
           <w:numId w:val="1"/>
         </w:numPr>
+        <w:spacing w:after="0"/>
       </w:pPr>
       <w:r>
         <w:rPr>
@@ -1821,6 +1811,7 @@
           <w:ilvl w:val="1"/>
           <w:numId w:val="1"/>
         </w:numPr>
+        <w:spacing w:after="0"/>
       </w:pPr>
       <w:r>
         <w:t>Documented characteristics in observations.md (contrast, skew, reflection, handwriting style).</w:t>
@@ -1885,6 +1876,7 @@
           <w:ilvl w:val="0"/>
           <w:numId w:val="2"/>
         </w:numPr>
+        <w:spacing w:after="0"/>
       </w:pPr>
       <w:r>
         <w:t>Installed OpenCV and confirmed it's working (4.13.0)</w:t>
@@ -1896,6 +1888,7 @@
           <w:ilvl w:val="0"/>
           <w:numId w:val="2"/>
         </w:numPr>
+        <w:spacing w:after="0"/>
       </w:pPr>
       <w:r>
         <w:t xml:space="preserve">Wrote preprocess.py with a working </w:t>
@@ -3945,7 +3938,6 @@
           <w:lang w:eastAsia="en-IN"/>
           <w14:ligatures w14:val="none"/>
         </w:rPr>
-        <w:lastRenderedPageBreak/>
         <w:t xml:space="preserve">    </w:t>
       </w:r>
       <w:r>
@@ -4657,6 +4649,7 @@
           <w:ilvl w:val="0"/>
           <w:numId w:val="2"/>
         </w:numPr>
+        <w:spacing w:after="0"/>
       </w:pPr>
       <w:r>
         <w:t xml:space="preserve">Understood that cv2.imread() loads images as BGR (not RGB) — the classic </w:t>
@@ -4684,6 +4677,7 @@
           <w:ilvl w:val="0"/>
           <w:numId w:val="2"/>
         </w:numPr>
+        <w:spacing w:after="0"/>
       </w:pPr>
       <w:r>
         <w:t xml:space="preserve">Understood what cv2.cvtColor(..., cv2.COLOR_BGR2GRAY) actually does — collapsing 3 channels into 1 brightness value per </w:t>
@@ -4706,6 +4700,7 @@
           <w:ilvl w:val="0"/>
           <w:numId w:val="2"/>
         </w:numPr>
+        <w:spacing w:after="0"/>
       </w:pPr>
       <w:r>
         <w:t>Ran the script, saved a grayscale output with cv2.imwrite()</w:t>
@@ -4717,6 +4712,7 @@
           <w:ilvl w:val="0"/>
           <w:numId w:val="2"/>
         </w:numPr>
+        <w:spacing w:after="0"/>
       </w:pPr>
       <w:r>
         <w:t>Visually verified the output actually looks black-and-white</w:t>
@@ -4728,6 +4724,7 @@
           <w:ilvl w:val="0"/>
           <w:numId w:val="2"/>
         </w:numPr>
+        <w:spacing w:after="0"/>
       </w:pPr>
       <w:r>
         <w:t>Peeked at the raw pixel arrays to see the shape change from (H, W, 3) → (H, W) firsthand</w:t>
@@ -4769,6 +4766,7 @@
     </w:p>
     <w:p>
       <w:pPr>
+        <w:spacing w:after="0"/>
         <w:rPr>
           <w:b/>
           <w:bCs/>
@@ -4788,6 +4786,7 @@
           <w:ilvl w:val="0"/>
           <w:numId w:val="13"/>
         </w:numPr>
+        <w:spacing w:after="0"/>
       </w:pPr>
       <w:r>
         <w:t xml:space="preserve">Added a </w:t>
@@ -4804,6 +4803,36 @@
       <w:proofErr w:type="spellEnd"/>
       <w:r>
         <w:t>, method) function to preprocess.py, supporting two approaches:</w:t>
+      </w:r>
+    </w:p>
+    <w:p>
+      <w:pPr>
+        <w:spacing w:after="0"/>
+      </w:pPr>
+      <w:r>
+        <w:rPr>
+          <w:b/>
+          <w:bCs/>
+        </w:rPr>
+        <w:t>Otsu's method</w:t>
+      </w:r>
+      <w:r>
+        <w:t xml:space="preserve"> — automatically picks one global brightness cutoff for the whole image.</w:t>
+      </w:r>
+    </w:p>
+    <w:p>
+      <w:pPr>
+        <w:spacing w:after="0"/>
+      </w:pPr>
+      <w:r>
+        <w:rPr>
+          <w:b/>
+          <w:bCs/>
+        </w:rPr>
+        <w:t>Adaptive thresholding</w:t>
+      </w:r>
+      <w:r>
+        <w:t xml:space="preserve"> — calculates a local cutoff per region, meant to handle uneven lighting/shadows better.</w:t>
       </w:r>
     </w:p>
     <w:p>
@@ -4812,16 +4841,34 @@
           <w:ilvl w:val="0"/>
           <w:numId w:val="13"/>
         </w:numPr>
-      </w:pPr>
-      <w:r>
-        <w:rPr>
-          <w:b/>
-          <w:bCs/>
-        </w:rPr>
-        <w:t>Otsu's method</w:t>
-      </w:r>
-      <w:r>
-        <w:t xml:space="preserve"> — automatically picks one global brightness cutoff for the whole image.</w:t>
+        <w:spacing w:after="0"/>
+      </w:pPr>
+      <w:r>
+        <w:t xml:space="preserve">Extended preprocess.py with </w:t>
+      </w:r>
+      <w:proofErr w:type="spellStart"/>
+      <w:r>
+        <w:t>process_sample_</w:t>
+      </w:r>
+      <w:proofErr w:type="gramStart"/>
+      <w:r>
+        <w:t>images</w:t>
+      </w:r>
+      <w:proofErr w:type="spellEnd"/>
+      <w:r>
+        <w:t>(</w:t>
+      </w:r>
+      <w:proofErr w:type="gramEnd"/>
+      <w:r>
+        <w:t>) to loop over images in data/raw/, run both methods, and save results to data/processed/</w:t>
+      </w:r>
+      <w:proofErr w:type="spellStart"/>
+      <w:r>
+        <w:t>otsu</w:t>
+      </w:r>
+      <w:proofErr w:type="spellEnd"/>
+      <w:r>
+        <w:t>/ and data/processed/adaptive/.</w:t>
       </w:r>
     </w:p>
     <w:p>
@@ -4830,73 +4877,24 @@
           <w:ilvl w:val="0"/>
           <w:numId w:val="13"/>
         </w:numPr>
-      </w:pPr>
-      <w:r>
-        <w:rPr>
-          <w:b/>
-          <w:bCs/>
-        </w:rPr>
-        <w:t>Adaptive thresholding</w:t>
-      </w:r>
-      <w:r>
-        <w:t xml:space="preserve"> — calculates a local cutoff per region, meant to handle uneven lighting/shadows better.</w:t>
-      </w:r>
-    </w:p>
-    <w:p>
-      <w:pPr>
-        <w:numPr>
-          <w:ilvl w:val="0"/>
-          <w:numId w:val="13"/>
-        </w:numPr>
-      </w:pPr>
-      <w:r>
-        <w:t xml:space="preserve">Extended preprocess.py with </w:t>
+        <w:spacing w:after="0"/>
+      </w:pPr>
+      <w:r>
+        <w:t xml:space="preserve">Created a separate compare_outputs.py script to generate a visual side-by-side grid (original vs. </w:t>
       </w:r>
       <w:proofErr w:type="spellStart"/>
       <w:r>
-        <w:t>process_sample_</w:t>
-      </w:r>
-      <w:proofErr w:type="gramStart"/>
-      <w:r>
-        <w:t>images</w:t>
+        <w:t>otsu</w:t>
       </w:r>
       <w:proofErr w:type="spellEnd"/>
       <w:r>
-        <w:t>(</w:t>
-      </w:r>
-      <w:proofErr w:type="gramEnd"/>
-      <w:r>
-        <w:t>) to loop over images in data/raw/, run both methods, and save results to data/processed/</w:t>
-      </w:r>
-      <w:proofErr w:type="spellStart"/>
-      <w:r>
-        <w:t>otsu</w:t>
-      </w:r>
-      <w:proofErr w:type="spellEnd"/>
-      <w:r>
-        <w:t>/ and data/processed/adaptive/.</w:t>
-      </w:r>
-    </w:p>
-    <w:p>
-      <w:pPr>
-        <w:numPr>
-          <w:ilvl w:val="0"/>
-          <w:numId w:val="13"/>
-        </w:numPr>
-      </w:pPr>
-      <w:r>
-        <w:t xml:space="preserve">Created a separate compare_outputs.py script to generate a visual side-by-side grid (original vs. </w:t>
-      </w:r>
-      <w:proofErr w:type="spellStart"/>
-      <w:r>
-        <w:t>otsu</w:t>
-      </w:r>
-      <w:proofErr w:type="spellEnd"/>
-      <w:r>
         <w:t xml:space="preserve"> vs. adaptive) using matplotlib, saved as comparison_grid.png.</w:t>
       </w:r>
     </w:p>
     <w:p>
+      <w:pPr>
+        <w:spacing w:after="0"/>
+      </w:pPr>
       <w:r>
         <w:rPr>
           <w:rFonts w:eastAsia="Times New Roman" w:cstheme="minorHAnsi"/>
@@ -4911,7 +4909,7 @@
     </w:p>
     <w:p>
       <w:pPr>
-        <w:spacing w:before="100" w:beforeAutospacing="1" w:after="100" w:afterAutospacing="1" w:line="240" w:lineRule="auto"/>
+        <w:spacing w:after="0" w:line="240" w:lineRule="auto"/>
         <w:rPr>
           <w:rFonts w:eastAsia="Times New Roman" w:cstheme="minorHAnsi"/>
           <w:kern w:val="0"/>
@@ -4971,7 +4969,7 @@
     </w:p>
     <w:p>
       <w:pPr>
-        <w:spacing w:before="100" w:beforeAutospacing="1" w:after="100" w:afterAutospacing="1" w:line="240" w:lineRule="auto"/>
+        <w:spacing w:after="0" w:line="240" w:lineRule="auto"/>
         <w:rPr>
           <w:rFonts w:eastAsia="Times New Roman" w:cstheme="minorHAnsi"/>
           <w:kern w:val="0"/>
@@ -5002,7 +5000,7 @@
     </w:p>
     <w:p>
       <w:pPr>
-        <w:spacing w:before="100" w:beforeAutospacing="1" w:after="100" w:afterAutospacing="1" w:line="240" w:lineRule="auto"/>
+        <w:spacing w:after="0" w:line="240" w:lineRule="auto"/>
         <w:rPr>
           <w:rFonts w:eastAsia="Times New Roman" w:cstheme="minorHAnsi"/>
           <w:kern w:val="0"/>
@@ -5019,7 +5017,6 @@
           <w:lang w:eastAsia="en-IN"/>
           <w14:ligatures w14:val="none"/>
         </w:rPr>
-        <w:lastRenderedPageBreak/>
         <w:t>Analogy:</w:t>
       </w:r>
       <w:r>
@@ -5034,7 +5031,7 @@
     </w:p>
     <w:p>
       <w:pPr>
-        <w:spacing w:before="100" w:beforeAutospacing="1" w:after="100" w:afterAutospacing="1" w:line="240" w:lineRule="auto"/>
+        <w:spacing w:after="0" w:line="240" w:lineRule="auto"/>
         <w:outlineLvl w:val="3"/>
         <w:rPr>
           <w:rFonts w:eastAsia="Times New Roman" w:cstheme="minorHAnsi"/>
@@ -5072,7 +5069,7 @@
     </w:p>
     <w:p>
       <w:pPr>
-        <w:spacing w:before="100" w:beforeAutospacing="1" w:after="100" w:afterAutospacing="1" w:line="240" w:lineRule="auto"/>
+        <w:spacing w:before="100" w:beforeAutospacing="1" w:after="0" w:line="240" w:lineRule="auto"/>
         <w:rPr>
           <w:rFonts w:eastAsia="Times New Roman" w:cstheme="minorHAnsi"/>
           <w:kern w:val="0"/>
@@ -5132,7 +5129,7 @@
     </w:p>
     <w:p>
       <w:pPr>
-        <w:spacing w:before="100" w:beforeAutospacing="1" w:after="100" w:afterAutospacing="1" w:line="240" w:lineRule="auto"/>
+        <w:spacing w:after="0" w:line="240" w:lineRule="auto"/>
         <w:rPr>
           <w:rFonts w:eastAsia="Times New Roman" w:cstheme="minorHAnsi"/>
           <w:kern w:val="0"/>
@@ -5163,13 +5160,7 @@
     </w:p>
     <w:p>
       <w:pPr>
-        <w:spacing w:before="100" w:beforeAutospacing="1" w:after="100" w:afterAutospacing="1" w:line="240" w:lineRule="auto"/>
-        <w:rPr>
-          <w:rFonts w:eastAsia="Times New Roman" w:cstheme="minorHAnsi"/>
-          <w:kern w:val="0"/>
-          <w:lang w:eastAsia="en-IN"/>
-          <w14:ligatures w14:val="none"/>
-        </w:rPr>
+        <w:spacing w:after="0" w:line="240" w:lineRule="auto"/>
       </w:pPr>
       <w:r>
         <w:rPr>
@@ -5192,9 +5183,9 @@
         <w:t xml:space="preserve"> Instead of one pass/fail cutoff for the whole class, you grade each small group of nearby desks using a cutoff based on just that group's scores — accounting for the fact that maybe one row sat near a loud radiator and did worse, unrelated to actual ability.</w:t>
       </w:r>
     </w:p>
-    <w:p/>
-    <w:p>
-      <w:pPr>
+    <w:p>
+      <w:pPr>
+        <w:spacing w:after="0"/>
         <w:rPr>
           <w:b/>
           <w:bCs/>
@@ -5214,9 +5205,11 @@
           <w:ilvl w:val="0"/>
           <w:numId w:val="14"/>
         </w:numPr>
+        <w:spacing w:after="0"/>
       </w:pPr>
       <w:proofErr w:type="spellStart"/>
       <w:r>
+        <w:lastRenderedPageBreak/>
         <w:t>TypeError</w:t>
       </w:r>
       <w:proofErr w:type="spellEnd"/>
@@ -5245,6 +5238,7 @@
     </w:p>
     <w:p>
       <w:pPr>
+        <w:spacing w:after="0"/>
         <w:rPr>
           <w:b/>
           <w:bCs/>
@@ -5264,6 +5258,7 @@
           <w:ilvl w:val="0"/>
           <w:numId w:val="15"/>
         </w:numPr>
+        <w:spacing w:after="0"/>
       </w:pPr>
       <w:r>
         <w:t>On your evenly-lit prescription text crops (e.g. "Visas", "</w:t>
@@ -5293,6 +5288,7 @@
           <w:ilvl w:val="0"/>
           <w:numId w:val="15"/>
         </w:numPr>
+        <w:spacing w:after="0"/>
       </w:pPr>
       <w:r>
         <w:rPr>
@@ -5311,11 +5307,200 @@
           <w:ilvl w:val="0"/>
           <w:numId w:val="15"/>
         </w:numPr>
+        <w:spacing w:after="0"/>
       </w:pPr>
       <w:r>
         <w:t>Flagged as an open question: you haven't yet tested a photo with visible shadow/glare — the scenario adaptive is actually designed for — so the current conclusion is honest but not the full picture.</w:t>
       </w:r>
     </w:p>
+    <w:p>
+      <w:pPr>
+        <w:spacing w:after="0"/>
+        <w:ind w:left="720"/>
+      </w:pPr>
+    </w:p>
+    <w:p>
+      <w:pPr>
+        <w:spacing w:after="0"/>
+      </w:pPr>
+      <w:r>
+        <w:rPr>
+          <w:rFonts w:eastAsia="Times New Roman" w:cstheme="minorHAnsi"/>
+          <w:b/>
+          <w:bCs/>
+          <w:kern w:val="0"/>
+          <w:lang w:eastAsia="en-IN"/>
+          <w14:ligatures w14:val="none"/>
+        </w:rPr>
+        <w:t>Why binarization specifically matters</w:t>
+      </w:r>
+    </w:p>
+    <w:p>
+      <w:pPr>
+        <w:spacing w:after="0" w:line="240" w:lineRule="auto"/>
+        <w:rPr>
+          <w:rFonts w:eastAsia="Times New Roman" w:cstheme="minorHAnsi"/>
+          <w:kern w:val="0"/>
+          <w:lang w:eastAsia="en-IN"/>
+          <w14:ligatures w14:val="none"/>
+        </w:rPr>
+      </w:pPr>
+      <w:r>
+        <w:rPr>
+          <w:rFonts w:eastAsia="Times New Roman" w:cstheme="minorHAnsi"/>
+          <w:kern w:val="0"/>
+          <w:lang w:eastAsia="en-IN"/>
+          <w14:ligatures w14:val="none"/>
+        </w:rPr>
+        <w:t xml:space="preserve">OCR engines are much more accurate on </w:t>
+      </w:r>
+      <w:r>
+        <w:rPr>
+          <w:rFonts w:eastAsia="Times New Roman" w:cstheme="minorHAnsi"/>
+          <w:b/>
+          <w:bCs/>
+          <w:kern w:val="0"/>
+          <w:lang w:eastAsia="en-IN"/>
+          <w14:ligatures w14:val="none"/>
+        </w:rPr>
+        <w:t>clean black text on a white background</w:t>
+      </w:r>
+      <w:r>
+        <w:rPr>
+          <w:rFonts w:eastAsia="Times New Roman" w:cstheme="minorHAnsi"/>
+          <w:kern w:val="0"/>
+          <w:lang w:eastAsia="en-IN"/>
+          <w14:ligatures w14:val="none"/>
+        </w:rPr>
+        <w:t xml:space="preserve"> than on a raw photo with </w:t>
+      </w:r>
+      <w:proofErr w:type="spellStart"/>
+      <w:r>
+        <w:rPr>
+          <w:rFonts w:eastAsia="Times New Roman" w:cstheme="minorHAnsi"/>
+          <w:kern w:val="0"/>
+          <w:lang w:eastAsia="en-IN"/>
+          <w14:ligatures w14:val="none"/>
+        </w:rPr>
+        <w:t>color</w:t>
+      </w:r>
+      <w:proofErr w:type="spellEnd"/>
+      <w:r>
+        <w:rPr>
+          <w:rFonts w:eastAsia="Times New Roman" w:cstheme="minorHAnsi"/>
+          <w:kern w:val="0"/>
+          <w:lang w:eastAsia="en-IN"/>
+          <w14:ligatures w14:val="none"/>
+        </w:rPr>
+        <w:t xml:space="preserve">, shadows, glare, paper texture, or </w:t>
+      </w:r>
+      <w:proofErr w:type="spellStart"/>
+      <w:r>
+        <w:rPr>
+          <w:rFonts w:eastAsia="Times New Roman" w:cstheme="minorHAnsi"/>
+          <w:kern w:val="0"/>
+          <w:lang w:eastAsia="en-IN"/>
+          <w14:ligatures w14:val="none"/>
+        </w:rPr>
+        <w:t>gray</w:t>
+      </w:r>
+      <w:proofErr w:type="spellEnd"/>
+      <w:r>
+        <w:rPr>
+          <w:rFonts w:eastAsia="Times New Roman" w:cstheme="minorHAnsi"/>
+          <w:kern w:val="0"/>
+          <w:lang w:eastAsia="en-IN"/>
+          <w14:ligatures w14:val="none"/>
+        </w:rPr>
+        <w:t xml:space="preserve"> gradients. Binarization (turning the image into pure black/white) strips away all that visual noise and leaves just the shape of the text — which is what OCR actually needs to recognize letters correctly.</w:t>
+      </w:r>
+    </w:p>
+    <w:p>
+      <w:pPr>
+        <w:spacing w:after="0" w:line="240" w:lineRule="auto"/>
+        <w:outlineLvl w:val="3"/>
+        <w:rPr>
+          <w:rFonts w:eastAsia="Times New Roman" w:cstheme="minorHAnsi"/>
+          <w:b/>
+          <w:bCs/>
+          <w:kern w:val="0"/>
+          <w:lang w:eastAsia="en-IN"/>
+          <w14:ligatures w14:val="none"/>
+        </w:rPr>
+      </w:pPr>
+      <w:r>
+        <w:rPr>
+          <w:rFonts w:eastAsia="Times New Roman" w:cstheme="minorHAnsi"/>
+          <w:b/>
+          <w:bCs/>
+          <w:kern w:val="0"/>
+          <w:lang w:eastAsia="en-IN"/>
+          <w14:ligatures w14:val="none"/>
+        </w:rPr>
+        <w:t>Why two methods, not just one</w:t>
+      </w:r>
+    </w:p>
+    <w:p>
+      <w:pPr>
+        <w:spacing w:after="0" w:line="240" w:lineRule="auto"/>
+        <w:rPr>
+          <w:rFonts w:eastAsia="Times New Roman" w:cstheme="minorHAnsi"/>
+          <w:kern w:val="0"/>
+          <w:lang w:eastAsia="en-IN"/>
+          <w14:ligatures w14:val="none"/>
+        </w:rPr>
+      </w:pPr>
+      <w:r>
+        <w:rPr>
+          <w:rFonts w:eastAsia="Times New Roman" w:cstheme="minorHAnsi"/>
+          <w:kern w:val="0"/>
+          <w:lang w:eastAsia="en-IN"/>
+          <w14:ligatures w14:val="none"/>
+        </w:rPr>
+        <w:t xml:space="preserve">Because a badly-binarized image can literally </w:t>
+      </w:r>
+      <w:r>
+        <w:rPr>
+          <w:rFonts w:eastAsia="Times New Roman" w:cstheme="minorHAnsi"/>
+          <w:b/>
+          <w:bCs/>
+          <w:kern w:val="0"/>
+          <w:lang w:eastAsia="en-IN"/>
+          <w14:ligatures w14:val="none"/>
+        </w:rPr>
+        <w:t>delete your text</w:t>
+      </w:r>
+      <w:r>
+        <w:rPr>
+          <w:rFonts w:eastAsia="Times New Roman" w:cstheme="minorHAnsi"/>
+          <w:kern w:val="0"/>
+          <w:lang w:eastAsia="en-IN"/>
+          <w14:ligatures w14:val="none"/>
+        </w:rPr>
+        <w:t xml:space="preserve"> — e.g. Otsu might crush a shadowed half of a page to solid black, wiping out real handwriting in that region before OCR ever gets a chance to read it. Since you don't know in advance whether your specific photos have even or uneven lighting, you test both methods and observe which one keeps the text intact on </w:t>
+      </w:r>
+      <w:r>
+        <w:rPr>
+          <w:rFonts w:eastAsia="Times New Roman" w:cstheme="minorHAnsi"/>
+          <w:b/>
+          <w:bCs/>
+          <w:kern w:val="0"/>
+          <w:lang w:eastAsia="en-IN"/>
+          <w14:ligatures w14:val="none"/>
+        </w:rPr>
+        <w:t>your actual images</w:t>
+      </w:r>
+      <w:r>
+        <w:rPr>
+          <w:rFonts w:eastAsia="Times New Roman" w:cstheme="minorHAnsi"/>
+          <w:kern w:val="0"/>
+          <w:lang w:eastAsia="en-IN"/>
+          <w14:ligatures w14:val="none"/>
+        </w:rPr>
+        <w:t xml:space="preserve"> — instead of guessing and potentially breaking your pipeline silently.</w:t>
+      </w:r>
+    </w:p>
+    <w:p/>
     <w:p/>
     <w:sectPr>
       <w:pgSz w:w="11906" w:h="16838"/>
@@ -8182,6 +8367,7 @@
   <w:style w:type="character" w:default="1" w:styleId="DefaultParagraphFont">
     <w:name w:val="Default Paragraph Font"/>
     <w:uiPriority w:val="1"/>
+    <w:semiHidden/>
     <w:unhideWhenUsed/>
   </w:style>
   <w:style w:type="table" w:default="1" w:styleId="TableNormal">

</xml_diff>